<commit_message>
Shared table: the creators use the deployed server (legend-table.des0906.workers.dev)
Co-Authored-By: Claude Opus 5.5 <noreply@anthropic.com>
Claude-Session: https://claude.ai/code/session_015SADCFzhKijkC2foUmXrpC
</commit_message>
<xml_diff>
--- a/legend-dynamics/site/aurora/Aurora_GM_Guide.docx
+++ b/legend-dynamics/site/aurora/Aurora_GM_Guide.docx
@@ -5427,6 +5427,24 @@
       </w:r>
       <w:r>
         <w:t xml:space="preserve">rules and shows every roll. Add characters from the GM view and opponents from the Threats table (or make one up on the spot), then start: it keeps the turn order by Agility, and for each attack works out the range, the defense (Dodge, Parry or Block, one a round, and a second at −2 with Additional Defense), the boxes marked and any telling hit, offering a Spark point choices at the moment they apply. Hits land on the character cards and the battle map, and with gritty combat on, grievous wounds are rolled and kept. The panel keeps a log and a summary of the fight, which can be saved to a file. It’s a helper, not a rule: the GM can rule any result differently, and the log says so.</w:t>
+      </w:r>
+    </w:p>
+    <w:p>
+      <w:pPr>
+        <w:pStyle w:val="BodyText"/>
+      </w:pPr>
+      <w:r>
+        <w:rPr>
+          <w:bCs/>
+          <w:b/>
+        </w:rPr>
+        <w:t xml:space="preserve">The shared table.</w:t>
+      </w:r>
+      <w:r>
+        <w:t xml:space="preserve"> </w:t>
+      </w:r>
+      <w:r>
+        <w:t xml:space="preserve">The GM can start a shared table from the GM view and give the players its code; each player joins from their character’s Play tab. While they’re connected, every roll from a sheet is rolled by the table server, so the whole table sees the same dice as they land, in a live log on the Play tab and on the GM view, along with who rolled, against what, and any telling hit. A point reroll answers its own roll, once. Without a table, the roller works exactly as it always has.</w:t>
       </w:r>
     </w:p>
     <w:bookmarkEnd w:id="25"/>

</xml_diff>